<commit_message>
MIS report date format changed and report querry alignment changed
</commit_message>
<xml_diff>
--- a/docs/CA_Office_Suite_Business_Rules_Detailed.docx
+++ b/docs/CA_Office_Suite_Business_Rules_Detailed.docx
@@ -13280,6 +13280,19 @@
       <w:fldChar w:fldCharType="begin"/>
       <w:instrText xml:space="preserve"> PAGE </w:instrText>
       <w:fldChar w:fldCharType="separate"/>
+    </w:r>
+    <w:r>
+      <w:r>
+        <w:rPr>
+          <w:sz w:val="18"/>
+          <w:szCs w:val="18"/>
+          <w:rFonts w:ascii="Calibri" w:hAnsi="Calibri"/>
+          <w:color w:val="333333"/>
+        </w:rPr>
+        <w:t xml:space="preserve">1</w:t>
+      </w:r>
+    </w:r>
+    <w:r>
       <w:fldChar w:fldCharType="end"/>
     </w:r>
     <w:r>
@@ -13295,6 +13308,19 @@
       <w:fldChar w:fldCharType="begin"/>
       <w:instrText xml:space="preserve"> NUMPAGES </w:instrText>
       <w:fldChar w:fldCharType="separate"/>
+    </w:r>
+    <w:r>
+      <w:r>
+        <w:rPr>
+          <w:sz w:val="18"/>
+          <w:szCs w:val="18"/>
+          <w:rFonts w:ascii="Calibri" w:hAnsi="Calibri"/>
+          <w:color w:val="333333"/>
+        </w:rPr>
+        <w:t xml:space="preserve">1</w:t>
+      </w:r>
+    </w:r>
+    <w:r>
       <w:fldChar w:fldCharType="end"/>
     </w:r>
   </w:p>
@@ -13366,6 +13392,23 @@
       <w:color w:val="2F5496"/>
     </w:rPr>
   </w:style>
+  <w:style w:type="paragraph" w:styleId="Heading3">
+    <w:name w:val="heading 3"/>
+    <w:basedOn w:val="Normal"/>
+    <w:next w:val="Normal"/>
+    <w:uiPriority w:val="9"/>
+    <w:qFormat/>
+    <w:pPr>
+      <w:keepNext/>
+      <w:spacing w:before="120" w:after="60"/>
+      <w:outlineLvl w:val="2"/>
+    </w:pPr>
+    <w:rPr>
+      <w:sz w:val="22"/>
+      <w:b/>
+      <w:color w:val="2F5496"/>
+    </w:rPr>
+  </w:style>
   <w:style w:type="paragraph" w:styleId="ListParagraph">
     <w:name w:val="List Paragraph"/>
     <w:basedOn w:val="Normal"/>

</xml_diff>

<commit_message>
Lot of UI and structual changes
</commit_message>
<xml_diff>
--- a/docs/CA_Office_Suite_Business_Rules_Detailed.docx
+++ b/docs/CA_Office_Suite_Business_Rules_Detailed.docx
@@ -1586,7 +1586,7 @@
           <w:rFonts w:ascii="Calibri" w:hAnsi="Calibri"/>
           <w:color w:val="333333"/>
         </w:rPr>
-        <w:t xml:space="preserve">`{L1}{L2}{NNNN}`</w:t>
+        <w:t xml:space="preserve">`{L1}{NNNNN}`</w:t>
       </w:r>
       <w:r>
         <w:rPr>
@@ -1653,35 +1653,35 @@
           <w:rFonts w:ascii="Calibri" w:hAnsi="Calibri"/>
           <w:color w:val="333333"/>
         </w:rPr>
-        <w:t xml:space="preserve">L2:</w:t>
-      </w:r>
-      <w:r>
-        <w:rPr>
-          <w:sz w:val="22"/>
-          <w:szCs w:val="22"/>
-          <w:rFonts w:ascii="Calibri" w:hAnsi="Calibri"/>
-          <w:color w:val="333333"/>
-        </w:rPr>
-        <w:t xml:space="preserve"> First letter A–Z in </w:t>
-      </w:r>
-      <w:r>
-        <w:rPr>
-          <w:b/>
-          <w:sz w:val="22"/>
-          <w:szCs w:val="22"/>
-          <w:rFonts w:ascii="Calibri" w:hAnsi="Calibri"/>
-          <w:color w:val="333333"/>
-        </w:rPr>
-        <w:t xml:space="preserve">branch</w:t>
-      </w:r>
-      <w:r>
-        <w:rPr>
-          <w:sz w:val="22"/>
-          <w:szCs w:val="22"/>
-          <w:rFonts w:ascii="Calibri" w:hAnsi="Calibri"/>
-          <w:color w:val="333333"/>
-        </w:rPr>
-        <w:t xml:space="preserve"> name.</w:t>
+        <w:t xml:space="preserve">NNNNN:</w:t>
+      </w:r>
+      <w:r>
+        <w:rPr>
+          <w:sz w:val="22"/>
+          <w:szCs w:val="22"/>
+          <w:rFonts w:ascii="Calibri" w:hAnsi="Calibri"/>
+          <w:color w:val="333333"/>
+        </w:rPr>
+        <w:t xml:space="preserve"> 5-digit serial </w:t>
+      </w:r>
+      <w:r>
+        <w:rPr>
+          <w:b/>
+          <w:sz w:val="22"/>
+          <w:szCs w:val="22"/>
+          <w:rFonts w:ascii="Calibri" w:hAnsi="Calibri"/>
+          <w:color w:val="333333"/>
+        </w:rPr>
+        <w:t xml:space="preserve">per L1</w:t>
+      </w:r>
+      <w:r>
+        <w:rPr>
+          <w:sz w:val="22"/>
+          <w:szCs w:val="22"/>
+          <w:rFonts w:ascii="Calibri" w:hAnsi="Calibri"/>
+          <w:color w:val="333333"/>
+        </w:rPr>
+        <w:t xml:space="preserve"> (e.g. all `A` clients share one counter).</w:t>
       </w:r>
     </w:p>
     <w:p>
@@ -1696,49 +1696,6 @@
           <w:rFonts w:ascii="Calibri" w:hAnsi="Calibri"/>
           <w:color w:val="333333"/>
         </w:rPr>
-        <w:t xml:space="preserve">NNNN:</w:t>
-      </w:r>
-      <w:r>
-        <w:rPr>
-          <w:sz w:val="22"/>
-          <w:szCs w:val="22"/>
-          <w:rFonts w:ascii="Calibri" w:hAnsi="Calibri"/>
-          <w:color w:val="333333"/>
-        </w:rPr>
-        <w:t xml:space="preserve"> 4-digit serial </w:t>
-      </w:r>
-      <w:r>
-        <w:rPr>
-          <w:b/>
-          <w:sz w:val="22"/>
-          <w:szCs w:val="22"/>
-          <w:rFonts w:ascii="Calibri" w:hAnsi="Calibri"/>
-          <w:color w:val="333333"/>
-        </w:rPr>
-        <w:t xml:space="preserve">per prefix</w:t>
-      </w:r>
-      <w:r>
-        <w:rPr>
-          <w:sz w:val="22"/>
-          <w:szCs w:val="22"/>
-          <w:rFonts w:ascii="Calibri" w:hAnsi="Calibri"/>
-          <w:color w:val="333333"/>
-        </w:rPr>
-        <w:t xml:space="preserve"> (e.g. all `AN` clients share one counter).</w:t>
-      </w:r>
-    </w:p>
-    <w:p>
-      <w:pPr>
-        <w:pStyle w:val="ListParagraph"/>
-      </w:pPr>
-      <w:r>
-        <w:rPr>
-          <w:b/>
-          <w:sz w:val="22"/>
-          <w:szCs w:val="22"/>
-          <w:rFonts w:ascii="Calibri" w:hAnsi="Calibri"/>
-          <w:color w:val="333333"/>
-        </w:rPr>
         <w:t xml:space="preserve">Example:</w:t>
       </w:r>
       <w:r>
@@ -1748,26 +1705,26 @@
           <w:rFonts w:ascii="Calibri" w:hAnsi="Calibri"/>
           <w:color w:val="333333"/>
         </w:rPr>
-        <w:t xml:space="preserve"> Name “Antony &amp; Co”, branch Nagercoil → prefix </w:t>
-      </w:r>
-      <w:r>
-        <w:rPr>
-          <w:b/>
-          <w:sz w:val="22"/>
-          <w:szCs w:val="22"/>
-          <w:rFonts w:ascii="Calibri" w:hAnsi="Calibri"/>
-          <w:color w:val="333333"/>
-        </w:rPr>
-        <w:t xml:space="preserve">AN</w:t>
-      </w:r>
-      <w:r>
-        <w:rPr>
-          <w:sz w:val="22"/>
-          <w:szCs w:val="22"/>
-          <w:rFonts w:ascii="Calibri" w:hAnsi="Calibri"/>
-          <w:color w:val="333333"/>
-        </w:rPr>
-        <w:t xml:space="preserve"> → `AN0001`, `AN0002`, …</w:t>
+        <w:t xml:space="preserve"> “Antony &amp; Co” → prefix </w:t>
+      </w:r>
+      <w:r>
+        <w:rPr>
+          <w:b/>
+          <w:sz w:val="22"/>
+          <w:szCs w:val="22"/>
+          <w:rFonts w:ascii="Calibri" w:hAnsi="Calibri"/>
+          <w:color w:val="333333"/>
+        </w:rPr>
+        <w:t xml:space="preserve">A</w:t>
+      </w:r>
+      <w:r>
+        <w:rPr>
+          <w:sz w:val="22"/>
+          <w:szCs w:val="22"/>
+          <w:rFonts w:ascii="Calibri" w:hAnsi="Calibri"/>
+          <w:color w:val="333333"/>
+        </w:rPr>
+        <w:t xml:space="preserve"> → `A00001`, `A00002`, …</w:t>
       </w:r>
     </w:p>
     <w:p>

</xml_diff>